<commit_message>
John Sadler backlog blogs: uploaded to Drive as Google Docs, links in README
Co-Authored-By: Claude Opus 5.5 <noreply@anthropic.com>
</commit_message>
<xml_diff>
--- a/clients/john-sadler/blogs/2025-backlog/06-tankless-water-heater-sizing.docx
+++ b/clients/john-sadler/blogs/2025-backlog/06-tankless-water-heater-sizing.docx
@@ -111,15 +111,10 @@
         <w:rPr>
           <w:b/>
         </w:rPr>
-        <w:t>Quick Answer (Preformatted block)</w:t>
+        <w:t>Quick Answer (Preformatted block):</w:t>
       </w:r>
-    </w:p>
-    <w:p>
-      <w:pPr>
-        <w:pStyle w:val="IntenseQuote"/>
-      </w:pPr>
       <w:r>
-        <w:t>What size tankless water heater do I need? Add up the hot water flow of every fixture your household runs at the same time, then choose a unit that can still deliver that flow when it heats your coldest winter water to about 49°C (120°F). For many Surrey family homes running two showers and a dishwasher at once, that points to a large gas condensing unit, once the gas line and venting are confirmed.</w:t>
+        <w:t xml:space="preserve"> What size tankless water heater do I need? Add up the hot water flow of every fixture your household runs at the same time, then choose a unit that can still deliver that flow when it heats your coldest winter water to about 49°C (120°F). For many Surrey family homes running two showers and a dishwasher at once, that points to a large gas condensing unit, once the gas line and venting are confirmed.</w:t>
       </w:r>
     </w:p>
     <w:p>

</xml_diff>